<commit_message>
Fix report styling: left-align text, cleaner bullets
</commit_message>
<xml_diff>
--- a/Assignment1/docs/report.docx
+++ b/Assignment1/docs/report.docx
@@ -54,7 +54,6 @@
     </w:p>
     <w:p>
       <w:pPr>
-        <w:jc w:val="both"/>
         <w:spacing w:after="280"/>
       </w:pPr>
       <w:r>
@@ -86,7 +85,6 @@
     </w:p>
     <w:p>
       <w:pPr>
-        <w:jc w:val="both"/>
         <w:spacing w:after="280"/>
       </w:pPr>
       <w:r>
@@ -123,7 +121,6 @@
     </w:p>
     <w:p>
       <w:pPr>
-        <w:ind w:left="720" w:first-line="-720"/>
         <w:spacing w:after="160"/>
       </w:pPr>
       <w:r>
@@ -131,14 +128,10 @@
           <w:rFonts w:ascii="Helvetica" w:hAnsi="Helvetica" w:cs="Helvetica"/>
           <w:sz w:val="28"/>
           <w:sz-cs w:val="28"/>
-          <w:b/>
-          <w:color w:val="141414"/>
-        </w:rPr>
-        <w:t xml:space="preserve"/>
-        <w:tab/>
-        <w:t xml:space="preserve">•</w:t>
-        <w:tab/>
-        <w:t xml:space="preserve"/>
+          <w:spacing w:val="0"/>
+          <w:color w:val="141414"/>
+        </w:rPr>
+        <w:t xml:space="preserve">•  </w:t>
       </w:r>
       <w:r>
         <w:rPr>
@@ -164,7 +157,6 @@
     </w:p>
     <w:p>
       <w:pPr>
-        <w:ind w:left="720" w:first-line="-720"/>
         <w:spacing w:after="160"/>
       </w:pPr>
       <w:r>
@@ -172,14 +164,10 @@
           <w:rFonts w:ascii="Helvetica" w:hAnsi="Helvetica" w:cs="Helvetica"/>
           <w:sz w:val="28"/>
           <w:sz-cs w:val="28"/>
-          <w:b/>
-          <w:color w:val="141414"/>
-        </w:rPr>
-        <w:t xml:space="preserve"/>
-        <w:tab/>
-        <w:t xml:space="preserve">•</w:t>
-        <w:tab/>
-        <w:t xml:space="preserve"/>
+          <w:spacing w:val="0"/>
+          <w:color w:val="141414"/>
+        </w:rPr>
+        <w:t xml:space="preserve">•  </w:t>
       </w:r>
       <w:r>
         <w:rPr>
@@ -205,7 +193,6 @@
     </w:p>
     <w:p>
       <w:pPr>
-        <w:jc w:val="both"/>
         <w:spacing w:after="280"/>
       </w:pPr>
       <w:r>
@@ -237,7 +224,6 @@
     </w:p>
     <w:p>
       <w:pPr>
-        <w:jc w:val="both"/>
         <w:spacing w:after="280"/>
       </w:pPr>
       <w:r>
@@ -264,7 +250,6 @@
     </w:p>
     <w:p>
       <w:pPr>
-        <w:jc w:val="both"/>
         <w:spacing w:after="280"/>
       </w:pPr>
       <w:r>
@@ -291,7 +276,6 @@
     </w:p>
     <w:p>
       <w:pPr>
-        <w:jc w:val="both"/>
         <w:spacing w:after="280"/>
       </w:pPr>
       <w:r>
@@ -318,7 +302,6 @@
     </w:p>
     <w:p>
       <w:pPr>
-        <w:jc w:val="both"/>
         <w:spacing w:after="280"/>
       </w:pPr>
       <w:r>
@@ -361,7 +344,6 @@
     </w:p>
     <w:p>
       <w:pPr>
-        <w:jc w:val="both"/>
         <w:spacing w:after="280"/>
       </w:pPr>
       <w:r>
@@ -657,7 +639,6 @@
     </w:p>
     <w:p>
       <w:pPr>
-        <w:jc w:val="both"/>
         <w:spacing w:after="280"/>
       </w:pPr>
       <w:r>
@@ -690,7 +671,6 @@
     </w:p>
     <w:p>
       <w:pPr>
-        <w:jc w:val="both"/>
         <w:spacing w:after="280"/>
       </w:pPr>
       <w:r>
@@ -706,7 +686,6 @@
     </w:p>
     <w:p>
       <w:pPr>
-        <w:ind w:left="720" w:first-line="-720"/>
         <w:spacing w:after="160"/>
       </w:pPr>
       <w:r>
@@ -714,23 +693,10 @@
           <w:rFonts w:ascii="Helvetica" w:hAnsi="Helvetica" w:cs="Helvetica"/>
           <w:sz w:val="28"/>
           <w:sz-cs w:val="28"/>
-          <w:color w:val="141414"/>
-        </w:rPr>
-        <w:t xml:space="preserve"/>
-        <w:tab/>
-        <w:t xml:space="preserve">•</w:t>
-        <w:tab/>
-        <w:t xml:space="preserve"/>
-      </w:r>
-      <w:r>
-        <w:rPr>
-          <w:rFonts w:ascii="Helvetica" w:hAnsi="Helvetica" w:cs="Helvetica"/>
-          <w:sz w:val="28"/>
-          <w:sz-cs w:val="28"/>
-          <w:spacing w:val="0"/>
-          <w:color w:val="141414"/>
-        </w:rPr>
-        <w:t xml:space="preserve">A subclass constructor has to call the parent constructor, and in Dart that happens with </w:t>
+          <w:spacing w:val="0"/>
+          <w:color w:val="141414"/>
+        </w:rPr>
+        <w:t xml:space="preserve">•  A subclass constructor has to call the parent constructor, and in Dart that happens with </w:t>
       </w:r>
       <w:r>
         <w:rPr>
@@ -755,21 +721,52 @@
     </w:p>
     <w:p>
       <w:pPr>
-        <w:ind w:left="720" w:first-line="-720"/>
         <w:spacing w:after="160"/>
       </w:pPr>
+      <w:r>
+        <w:rPr>
+          <w:rFonts w:ascii="Helvetica" w:hAnsi="Helvetica" w:cs="Helvetica"/>
+          <w:sz w:val="28"/>
+          <w:sz-cs w:val="28"/>
+          <w:spacing w:val="0"/>
+          <w:color w:val="141414"/>
+        </w:rPr>
+        <w:t xml:space="preserve">•  </w:t>
+      </w:r>
       <w:r>
         <w:rPr>
           <w:rFonts w:ascii="Courier New" w:hAnsi="Courier New" w:cs="Courier New"/>
           <w:sz w:val="26"/>
           <w:sz-cs w:val="26"/>
-          <w:color w:val="141414"/>
-        </w:rPr>
-        <w:t xml:space="preserve"/>
-        <w:tab/>
-        <w:t xml:space="preserve">•</w:t>
-        <w:tab/>
-        <w:t xml:space="preserve"/>
+          <w:spacing w:val="0"/>
+          <w:color w:val="141414"/>
+        </w:rPr>
+        <w:t xml:space="preserve">@override</w:t>
+      </w:r>
+      <w:r>
+        <w:rPr>
+          <w:rFonts w:ascii="Helvetica" w:hAnsi="Helvetica" w:cs="Helvetica"/>
+          <w:sz w:val="28"/>
+          <w:sz-cs w:val="28"/>
+          <w:spacing w:val="0"/>
+          <w:color w:val="141414"/>
+        </w:rPr>
+        <w:t xml:space="preserve"> isn't required to make overriding work, but it's good practice because the compiler will warn you if the method signature doesn't actually match anything in the parent class. That saved me from a silly mistake later.</w:t>
+      </w:r>
+    </w:p>
+    <w:p>
+      <w:pPr>
+        <w:spacing w:after="160"/>
+      </w:pPr>
+      <w:r>
+        <w:rPr>
+          <w:rFonts w:ascii="Helvetica" w:hAnsi="Helvetica" w:cs="Helvetica"/>
+          <w:sz w:val="28"/>
+          <w:sz-cs w:val="28"/>
+          <w:spacing w:val="0"/>
+          <w:color w:val="141414"/>
+        </w:rPr>
+        <w:t xml:space="preserve">•  Calling </w:t>
       </w:r>
       <w:r>
         <w:rPr>
@@ -779,22 +776,21 @@
           <w:spacing w:val="0"/>
           <w:color w:val="141414"/>
         </w:rPr>
-        <w:t xml:space="preserve">@override</w:t>
-      </w:r>
-      <w:r>
-        <w:rPr>
-          <w:rFonts w:ascii="Helvetica" w:hAnsi="Helvetica" w:cs="Helvetica"/>
-          <w:sz w:val="28"/>
-          <w:sz-cs w:val="28"/>
-          <w:spacing w:val="0"/>
-          <w:color w:val="141414"/>
-        </w:rPr>
-        <w:t xml:space="preserve"> isn't required to make overriding work, but it's good practice because the compiler will warn you if the method signature doesn't actually match anything in the parent class. That saved me from a silly mistake later.</w:t>
-      </w:r>
-    </w:p>
-    <w:p>
-      <w:pPr>
-        <w:ind w:left="720" w:first-line="-720"/>
+        <w:t xml:space="preserve">super.showInfo()</w:t>
+      </w:r>
+      <w:r>
+        <w:rPr>
+          <w:rFonts w:ascii="Helvetica" w:hAnsi="Helvetica" w:cs="Helvetica"/>
+          <w:sz w:val="28"/>
+          <w:sz-cs w:val="28"/>
+          <w:spacing w:val="0"/>
+          <w:color w:val="141414"/>
+        </w:rPr>
+        <w:t xml:space="preserve"> inside the overridden method let me reuse the parent's printing logic instead of copy-pasting it, which is the actual point of inheritance - extending behavior, not rewriting it.</w:t>
+      </w:r>
+    </w:p>
+    <w:p>
+      <w:pPr>
         <w:spacing w:after="160"/>
       </w:pPr>
       <w:r>
@@ -802,72 +798,10 @@
           <w:rFonts w:ascii="Helvetica" w:hAnsi="Helvetica" w:cs="Helvetica"/>
           <w:sz w:val="28"/>
           <w:sz-cs w:val="28"/>
-          <w:color w:val="141414"/>
-        </w:rPr>
-        <w:t xml:space="preserve"/>
-        <w:tab/>
-        <w:t xml:space="preserve">•</w:t>
-        <w:tab/>
-        <w:t xml:space="preserve"/>
-      </w:r>
-      <w:r>
-        <w:rPr>
-          <w:rFonts w:ascii="Helvetica" w:hAnsi="Helvetica" w:cs="Helvetica"/>
-          <w:sz w:val="28"/>
-          <w:sz-cs w:val="28"/>
-          <w:spacing w:val="0"/>
-          <w:color w:val="141414"/>
-        </w:rPr>
-        <w:t xml:space="preserve">Calling </w:t>
-      </w:r>
-      <w:r>
-        <w:rPr>
-          <w:rFonts w:ascii="Courier New" w:hAnsi="Courier New" w:cs="Courier New"/>
-          <w:sz w:val="26"/>
-          <w:sz-cs w:val="26"/>
-          <w:spacing w:val="0"/>
-          <w:color w:val="141414"/>
-        </w:rPr>
-        <w:t xml:space="preserve">super.showInfo()</w:t>
-      </w:r>
-      <w:r>
-        <w:rPr>
-          <w:rFonts w:ascii="Helvetica" w:hAnsi="Helvetica" w:cs="Helvetica"/>
-          <w:sz w:val="28"/>
-          <w:sz-cs w:val="28"/>
-          <w:spacing w:val="0"/>
-          <w:color w:val="141414"/>
-        </w:rPr>
-        <w:t xml:space="preserve"> inside the overridden method let me reuse the parent's printing logic instead of copy-pasting it, which is the actual point of inheritance - extending behavior, not rewriting it.</w:t>
-      </w:r>
-    </w:p>
-    <w:p>
-      <w:pPr>
-        <w:ind w:left="720" w:first-line="-720"/>
-        <w:spacing w:after="160"/>
-      </w:pPr>
-      <w:r>
-        <w:rPr>
-          <w:rFonts w:ascii="Helvetica" w:hAnsi="Helvetica" w:cs="Helvetica"/>
-          <w:sz w:val="28"/>
-          <w:sz-cs w:val="28"/>
-          <w:color w:val="141414"/>
-        </w:rPr>
-        <w:t xml:space="preserve"/>
-        <w:tab/>
-        <w:t xml:space="preserve">•</w:t>
-        <w:tab/>
-        <w:t xml:space="preserve"/>
-      </w:r>
-      <w:r>
-        <w:rPr>
-          <w:rFonts w:ascii="Helvetica" w:hAnsi="Helvetica" w:cs="Helvetica"/>
-          <w:sz w:val="28"/>
-          <w:sz-cs w:val="28"/>
-          <w:spacing w:val="0"/>
-          <w:color w:val="141414"/>
-        </w:rPr>
-        <w:t xml:space="preserve">Keeping model classes in a separate file from main.dart and importing them makes the entry point much easier to read, and it's closer to how a real Dart package would be laid out.</w:t>
+          <w:spacing w:val="0"/>
+          <w:color w:val="141414"/>
+        </w:rPr>
+        <w:t xml:space="preserve">•  Keeping model classes in a separate file from main.dart and importing them makes the entry point much easier to read, and it's closer to how a real Dart package would be laid out.</w:t>
       </w:r>
     </w:p>
     <w:p>
@@ -1012,7 +946,6 @@
     </w:p>
     <w:p>
       <w:pPr>
-        <w:jc w:val="both"/>
         <w:spacing w:after="280"/>
       </w:pPr>
       <w:r>

</xml_diff>

<commit_message>
Fix missing paragraph spacing in challenges section
</commit_message>
<xml_diff>
--- a/Assignment1/docs/report.docx
+++ b/Assignment1/docs/report.docx
@@ -821,7 +821,9 @@
       </w:r>
     </w:p>
     <w:p>
-      <w:pPr/>
+      <w:pPr>
+        <w:spacing w:after="120"/>
+      </w:pPr>
       <w:r>
         <w:rPr>
           <w:rFonts w:ascii="Helvetica" w:hAnsi="Helvetica" w:cs="Helvetica"/>
@@ -833,9 +835,21 @@
         </w:rPr>
         <w:t xml:space="preserve">Problem 1: Deciding what "issuing" a book should actually change.</w:t>
       </w:r>
-    </w:p>
-    <w:p>
-      <w:pPr/>
+      <w:r>
+        <w:rPr>
+          <w:rFonts w:ascii="Helvetica" w:hAnsi="Helvetica" w:cs="Helvetica"/>
+          <w:sz w:val="28"/>
+          <w:sz-cs w:val="28"/>
+          <w:spacing w:val="0"/>
+          <w:color w:val="141414"/>
+        </w:rPr>
+        <w:t xml:space="preserve"/>
+      </w:r>
+    </w:p>
+    <w:p>
+      <w:pPr>
+        <w:spacing w:after="400"/>
+      </w:pPr>
       <w:r>
         <w:rPr>
           <w:rFonts w:ascii="Helvetica" w:hAnsi="Helvetica" w:cs="Helvetica"/>
@@ -848,7 +862,9 @@
       </w:r>
     </w:p>
     <w:p>
-      <w:pPr/>
+      <w:pPr>
+        <w:spacing w:after="120"/>
+      </w:pPr>
       <w:r>
         <w:rPr>
           <w:rFonts w:ascii="Helvetica" w:hAnsi="Helvetica" w:cs="Helvetica"/>
@@ -860,9 +876,21 @@
         </w:rPr>
         <w:t xml:space="preserve">Problem 2: Inheritance constructor syntax.</w:t>
       </w:r>
-    </w:p>
-    <w:p>
-      <w:pPr/>
+      <w:r>
+        <w:rPr>
+          <w:rFonts w:ascii="Helvetica" w:hAnsi="Helvetica" w:cs="Helvetica"/>
+          <w:sz w:val="28"/>
+          <w:sz-cs w:val="28"/>
+          <w:spacing w:val="0"/>
+          <w:color w:val="141414"/>
+        </w:rPr>
+        <w:t xml:space="preserve"/>
+      </w:r>
+    </w:p>
+    <w:p>
+      <w:pPr>
+        <w:spacing w:after="400"/>
+      </w:pPr>
       <w:r>
         <w:rPr>
           <w:rFonts w:ascii="Helvetica" w:hAnsi="Helvetica" w:cs="Helvetica"/>
@@ -875,7 +903,9 @@
       </w:r>
     </w:p>
     <w:p>
-      <w:pPr/>
+      <w:pPr>
+        <w:spacing w:after="120"/>
+      </w:pPr>
       <w:r>
         <w:rPr>
           <w:rFonts w:ascii="Helvetica" w:hAnsi="Helvetica" w:cs="Helvetica"/>
@@ -887,9 +917,21 @@
         </w:rPr>
         <w:t xml:space="preserve">Problem 3: Splitting the file.</w:t>
       </w:r>
-    </w:p>
-    <w:p>
-      <w:pPr/>
+      <w:r>
+        <w:rPr>
+          <w:rFonts w:ascii="Helvetica" w:hAnsi="Helvetica" w:cs="Helvetica"/>
+          <w:sz w:val="28"/>
+          <w:sz-cs w:val="28"/>
+          <w:spacing w:val="0"/>
+          <w:color w:val="141414"/>
+        </w:rPr>
+        <w:t xml:space="preserve"/>
+      </w:r>
+    </w:p>
+    <w:p>
+      <w:pPr>
+        <w:spacing w:after="400"/>
+      </w:pPr>
       <w:r>
         <w:rPr>
           <w:rFonts w:ascii="Helvetica" w:hAnsi="Helvetica" w:cs="Helvetica"/>
@@ -902,7 +944,9 @@
       </w:r>
     </w:p>
     <w:p>
-      <w:pPr/>
+      <w:pPr>
+        <w:spacing w:after="120"/>
+      </w:pPr>
       <w:r>
         <w:rPr>
           <w:rFonts w:ascii="Helvetica" w:hAnsi="Helvetica" w:cs="Helvetica"/>
@@ -914,9 +958,21 @@
         </w:rPr>
         <w:t xml:space="preserve">Problem 4: Testing without a UI.</w:t>
       </w:r>
-    </w:p>
-    <w:p>
-      <w:pPr/>
+      <w:r>
+        <w:rPr>
+          <w:rFonts w:ascii="Helvetica" w:hAnsi="Helvetica" w:cs="Helvetica"/>
+          <w:sz w:val="28"/>
+          <w:sz-cs w:val="28"/>
+          <w:spacing w:val="0"/>
+          <w:color w:val="141414"/>
+        </w:rPr>
+        <w:t xml:space="preserve"/>
+      </w:r>
+    </w:p>
+    <w:p>
+      <w:pPr>
+        <w:spacing w:after="400"/>
+      </w:pPr>
       <w:r>
         <w:rPr>
           <w:rFonts w:ascii="Helvetica" w:hAnsi="Helvetica" w:cs="Helvetica"/>

</xml_diff>

<commit_message>
Embed real terminal screenshot into report docx and md
</commit_message>
<xml_diff>
--- a/Assignment1/docs/report.docx
+++ b/Assignment1/docs/report.docx
@@ -650,7 +650,49 @@
           <w:spacing w:val="0"/>
           <w:color w:val="434343"/>
         </w:rPr>
-        <w:t xml:space="preserve">(Screenshot of this same output is attached separately as required.)</w:t>
+        <w:t xml:space="preserve">Screenshot of this same run:</w:t>
+      </w:r>
+    </w:p>
+    <w:p>
+      <w:pPr>
+        <w:jc w:val="left"/>
+      </w:pPr>
+      <w:r>
+        <w:drawing>
+          <wp:inline xmlns:wp="http://schemas.openxmlformats.org/drawingml/2006/wordprocessingDrawing" distT="0" distB="0" distL="0" distR="0">
+            <wp:extent cx="5669280" cy="2508732"/>
+            <wp:effectExtent l="0" t="0" r="0" b="0"/>
+            <wp:docPr id="1" name="Screenshot"/>
+            <wp:cNvGraphicFramePr>
+              <a:graphicFrameLocks xmlns:a="http://schemas.openxmlformats.org/drawingml/2006/main" noChangeAspect="1"/>
+            </wp:cNvGraphicFramePr>
+            <a:graphic xmlns:a="http://schemas.openxmlformats.org/drawingml/2006/main">
+              <a:graphicData uri="http://schemas.openxmlformats.org/drawingml/2006/picture">
+                <pic:pic xmlns:pic="http://schemas.openxmlformats.org/drawingml/2006/picture">
+                  <pic:nvPicPr>
+                    <pic:cNvPr id="1" name="Screenshot"/>
+                    <pic:cNvPicPr/>
+                  </pic:nvPicPr>
+                  <pic:blipFill>
+                    <a:blip xmlns:r="http://schemas.openxmlformats.org/officeDocument/2006/relationships" r:embed="rIdScreenshot1"/>
+                    <a:stretch>
+                      <a:fillRect/>
+                    </a:stretch>
+                  </pic:blipFill>
+                  <pic:spPr>
+                    <a:xfrm>
+                      <a:off x="0" y="0"/>
+                      <a:ext cx="5669280" cy="2508732"/>
+                    </a:xfrm>
+                    <a:prstGeom prst="rect">
+                      <a:avLst/>
+                    </a:prstGeom>
+                  </pic:spPr>
+                </pic:pic>
+              </a:graphicData>
+            </a:graphic>
+          </wp:inline>
+        </w:drawing>
       </w:r>
     </w:p>
     <w:p>

</xml_diff>

<commit_message>
Split library_system.dart into one file per class
</commit_message>
<xml_diff>
--- a/Assignment1/docs/report.docx
+++ b/Assignment1/docs/report.docx
@@ -95,7 +95,7 @@
           <w:spacing w:val="0"/>
           <w:color w:val="141414"/>
         </w:rPr>
-        <w:t xml:space="preserve">The project has two files inside </w:t>
+        <w:t xml:space="preserve">The project has one file per feature inside </w:t>
       </w:r>
       <w:r>
         <w:rPr>
@@ -142,17 +142,17 @@
           <w:spacing w:val="0"/>
           <w:color w:val="141414"/>
         </w:rPr>
-        <w:t xml:space="preserve">library_system.dart</w:t>
-      </w:r>
-      <w:r>
-        <w:rPr>
-          <w:rFonts w:ascii="Helvetica" w:hAnsi="Helvetica" w:cs="Helvetica"/>
-          <w:sz w:val="28"/>
-          <w:sz-cs w:val="28"/>
-          <w:spacing w:val="0"/>
-          <w:color w:val="141414"/>
-        </w:rPr>
-        <w:t xml:space="preserve"> holds all the classes: Book, DigitalBook (which extends Book), and Library. It also has a small helper function, countAvailableBooks, that loops through a list of books and counts how many are not issued.</w:t>
+        <w:t xml:space="preserve">book.dart</w:t>
+      </w:r>
+      <w:r>
+        <w:rPr>
+          <w:rFonts w:ascii="Helvetica" w:hAnsi="Helvetica" w:cs="Helvetica"/>
+          <w:sz w:val="28"/>
+          <w:sz-cs w:val="28"/>
+          <w:spacing w:val="0"/>
+          <w:color w:val="141414"/>
+        </w:rPr>
+        <w:t xml:space="preserve"> holds the Book class.</w:t>
       </w:r>
     </w:p>
     <w:p>
@@ -178,6 +178,114 @@
           <w:spacing w:val="0"/>
           <w:color w:val="141414"/>
         </w:rPr>
+        <w:t xml:space="preserve">digital_book.dart</w:t>
+      </w:r>
+      <w:r>
+        <w:rPr>
+          <w:rFonts w:ascii="Helvetica" w:hAnsi="Helvetica" w:cs="Helvetica"/>
+          <w:sz w:val="28"/>
+          <w:sz-cs w:val="28"/>
+          <w:spacing w:val="0"/>
+          <w:color w:val="141414"/>
+        </w:rPr>
+        <w:t xml:space="preserve"> holds DigitalBook, which extends Book.</w:t>
+      </w:r>
+    </w:p>
+    <w:p>
+      <w:pPr>
+        <w:spacing w:after="160"/>
+      </w:pPr>
+      <w:r>
+        <w:rPr>
+          <w:rFonts w:ascii="Helvetica" w:hAnsi="Helvetica" w:cs="Helvetica"/>
+          <w:sz w:val="28"/>
+          <w:sz-cs w:val="28"/>
+          <w:spacing w:val="0"/>
+          <w:color w:val="141414"/>
+        </w:rPr>
+        <w:t xml:space="preserve">•  </w:t>
+      </w:r>
+      <w:r>
+        <w:rPr>
+          <w:rFonts w:ascii="Helvetica" w:hAnsi="Helvetica" w:cs="Helvetica"/>
+          <w:sz w:val="28"/>
+          <w:sz-cs w:val="28"/>
+          <w:b/>
+          <w:spacing w:val="0"/>
+          <w:color w:val="141414"/>
+        </w:rPr>
+        <w:t xml:space="preserve">library.dart</w:t>
+      </w:r>
+      <w:r>
+        <w:rPr>
+          <w:rFonts w:ascii="Helvetica" w:hAnsi="Helvetica" w:cs="Helvetica"/>
+          <w:sz w:val="28"/>
+          <w:sz-cs w:val="28"/>
+          <w:spacing w:val="0"/>
+          <w:color w:val="141414"/>
+        </w:rPr>
+        <w:t xml:space="preserve"> holds the Library class - adding, issuing, returning, and listing books.</w:t>
+      </w:r>
+    </w:p>
+    <w:p>
+      <w:pPr>
+        <w:spacing w:after="160"/>
+      </w:pPr>
+      <w:r>
+        <w:rPr>
+          <w:rFonts w:ascii="Helvetica" w:hAnsi="Helvetica" w:cs="Helvetica"/>
+          <w:sz w:val="28"/>
+          <w:sz-cs w:val="28"/>
+          <w:spacing w:val="0"/>
+          <w:color w:val="141414"/>
+        </w:rPr>
+        <w:t xml:space="preserve">•  </w:t>
+      </w:r>
+      <w:r>
+        <w:rPr>
+          <w:rFonts w:ascii="Helvetica" w:hAnsi="Helvetica" w:cs="Helvetica"/>
+          <w:sz w:val="28"/>
+          <w:sz-cs w:val="28"/>
+          <w:b/>
+          <w:spacing w:val="0"/>
+          <w:color w:val="141414"/>
+        </w:rPr>
+        <w:t xml:space="preserve">book_utils.dart</w:t>
+      </w:r>
+      <w:r>
+        <w:rPr>
+          <w:rFonts w:ascii="Helvetica" w:hAnsi="Helvetica" w:cs="Helvetica"/>
+          <w:sz w:val="28"/>
+          <w:sz-cs w:val="28"/>
+          <w:spacing w:val="0"/>
+          <w:color w:val="141414"/>
+        </w:rPr>
+        <w:t xml:space="preserve"> holds countAvailableBooks, a standalone helper function.</w:t>
+      </w:r>
+    </w:p>
+    <w:p>
+      <w:pPr>
+        <w:spacing w:after="160"/>
+      </w:pPr>
+      <w:r>
+        <w:rPr>
+          <w:rFonts w:ascii="Helvetica" w:hAnsi="Helvetica" w:cs="Helvetica"/>
+          <w:sz w:val="28"/>
+          <w:sz-cs w:val="28"/>
+          <w:spacing w:val="0"/>
+          <w:color w:val="141414"/>
+        </w:rPr>
+        <w:t xml:space="preserve">•  </w:t>
+      </w:r>
+      <w:r>
+        <w:rPr>
+          <w:rFonts w:ascii="Helvetica" w:hAnsi="Helvetica" w:cs="Helvetica"/>
+          <w:sz w:val="28"/>
+          <w:sz-cs w:val="28"/>
+          <w:b/>
+          <w:spacing w:val="0"/>
+          <w:color w:val="141414"/>
+        </w:rPr>
         <w:t xml:space="preserve">main.dart</w:t>
       </w:r>
       <w:r>
@@ -188,7 +296,7 @@
           <w:spacing w:val="0"/>
           <w:color w:val="141414"/>
         </w:rPr>
-        <w:t xml:space="preserve"> is just the entry point. It imports library_system.dart, creates a Library, adds a few books, and calls its methods.</w:t>
+        <w:t xml:space="preserve"> is just the entry point. It imports all the above, creates a Library, adds a few books, and calls its methods.</w:t>
       </w:r>
     </w:p>
     <w:p>
@@ -203,7 +311,7 @@
           <w:spacing w:val="0"/>
           <w:color w:val="141414"/>
         </w:rPr>
-        <w:t xml:space="preserve">I kept the logic separate from main.dart on purpose so the entry point stays short and the actual "model" of the library lives in its own file, which felt closer to how real projects are organized.</w:t>
+        <w:t xml:space="preserve">I split it this way so each file has one job. digital_book.dart and library.dart both import book.dart since they depend on the Book class, and main.dart imports everything to wire it all together.</w:t>
       </w:r>
     </w:p>
     <w:p>
@@ -843,7 +951,7 @@
           <w:spacing w:val="0"/>
           <w:color w:val="141414"/>
         </w:rPr>
-        <w:t xml:space="preserve">•  Keeping model classes in a separate file from main.dart and importing them makes the entry point much easier to read, and it's closer to how a real Dart package would be laid out.</w:t>
+        <w:t xml:space="preserve">•  Keeping each class in its own file and importing them makes the entry point much easier to read, and it's closer to how a real Dart package would be laid out.</w:t>
       </w:r>
     </w:p>
     <w:p>
@@ -957,7 +1065,7 @@
           <w:spacing w:val="0"/>
           <w:color w:val="141414"/>
         </w:rPr>
-        <w:t xml:space="preserve">Problem 3: Splitting the file.</w:t>
+        <w:t xml:space="preserve">Problem 3: Splitting into one file per class.</w:t>
       </w:r>
       <w:r>
         <w:rPr>
@@ -982,7 +1090,7 @@
           <w:spacing w:val="0"/>
           <w:color w:val="141414"/>
         </w:rPr>
-        <w:t xml:space="preserve">When I first wrote everything in one main.dart, it worked, but it felt messy to have the classes and the "running" logic in the same place. I moved the classes and the helper function into library_system.dart and just imported it with import 'library_system.dart'; in main.dart. Had a small mix-up with the import path at first since I was thinking I needed the full lib/ prefix, but within the lib folder itself you just import by filename directly.</w:t>
+        <w:t xml:space="preserve">When I first wrote everything in one main.dart, it worked, but it felt messy to have every class and the "running" logic in the same place. I split it into book.dart, digital_book.dart, library.dart, and book_utils.dart, and imported them where needed with plain relative imports like import 'book.dart';. Had a small mix-up with the import path at first since I was thinking I needed the full lib/ prefix, but within the lib folder itself you just import by filename directly. I also had to remember that digital_book.dart and library.dart each need their own import 'book.dart'; since Dart doesn't share imports across files automatically.</w:t>
       </w:r>
     </w:p>
     <w:p>

</xml_diff>

<commit_message>
Overhaul docx styling: real line spacing, heading dividers, section numbers
</commit_message>
<xml_diff>
--- a/Assignment1/docs/report.docx
+++ b/Assignment1/docs/report.docx
@@ -5,7 +5,7 @@
     <w:p>
       <w:pPr>
         <w:jc w:val="center"/>
-        <w:spacing w:after="80"/>
+        <w:spacing w:after="80" w:line="300" w:lineRule="auto"/>
       </w:pPr>
       <w:r>
         <w:rPr>
@@ -24,6 +24,7 @@
     <w:p>
       <w:pPr>
         <w:jc w:val="center"/>
+        <w:spacing w:after="120" w:line="300" w:lineRule="auto"/>
       </w:pPr>
       <w:r>
         <w:rPr>
@@ -38,7 +39,10 @@
     </w:p>
     <w:p>
       <w:pPr>
-        <w:spacing w:after="200"/>
+        <w:spacing w:before="360" w:after="200" w:line="300" w:lineRule="auto"/>
+        <w:pBdr>
+          <w:bottom w:val="single" w:sz="6" w:space="4" w:color="999999"/>
+        </w:pBdr>
       </w:pPr>
       <w:r>
         <w:rPr>
@@ -49,12 +53,12 @@
           <w:spacing w:val="0"/>
           <w:color w:val="141414"/>
         </w:rPr>
-        <w:t xml:space="preserve">What the assignment was</w:t>
-      </w:r>
-    </w:p>
-    <w:p>
-      <w:pPr>
-        <w:spacing w:after="280"/>
+        <w:t xml:space="preserve">1. What the assignment was</w:t>
+      </w:r>
+    </w:p>
+    <w:p>
+      <w:pPr>
+        <w:spacing w:after="280" w:line="300" w:lineRule="auto"/>
       </w:pPr>
       <w:r>
         <w:rPr>
@@ -69,7 +73,10 @@
     </w:p>
     <w:p>
       <w:pPr>
-        <w:spacing w:after="200"/>
+        <w:spacing w:before="360" w:after="200" w:line="300" w:lineRule="auto"/>
+        <w:pBdr>
+          <w:bottom w:val="single" w:sz="6" w:space="4" w:color="999999"/>
+        </w:pBdr>
       </w:pPr>
       <w:r>
         <w:rPr>
@@ -80,12 +87,12 @@
           <w:spacing w:val="0"/>
           <w:color w:val="141414"/>
         </w:rPr>
-        <w:t xml:space="preserve">How the program is structured</w:t>
-      </w:r>
-    </w:p>
-    <w:p>
-      <w:pPr>
-        <w:spacing w:after="280"/>
+        <w:t xml:space="preserve">2. How the program is structured</w:t>
+      </w:r>
+    </w:p>
+    <w:p>
+      <w:pPr>
+        <w:spacing w:after="280" w:line="300" w:lineRule="auto"/>
       </w:pPr>
       <w:r>
         <w:rPr>
@@ -121,7 +128,7 @@
     </w:p>
     <w:p>
       <w:pPr>
-        <w:spacing w:after="160"/>
+        <w:spacing w:after="160" w:line="300" w:lineRule="auto"/>
       </w:pPr>
       <w:r>
         <w:rPr>
@@ -157,7 +164,7 @@
     </w:p>
     <w:p>
       <w:pPr>
-        <w:spacing w:after="160"/>
+        <w:spacing w:after="160" w:line="300" w:lineRule="auto"/>
       </w:pPr>
       <w:r>
         <w:rPr>
@@ -193,7 +200,7 @@
     </w:p>
     <w:p>
       <w:pPr>
-        <w:spacing w:after="160"/>
+        <w:spacing w:after="160" w:line="300" w:lineRule="auto"/>
       </w:pPr>
       <w:r>
         <w:rPr>
@@ -229,7 +236,7 @@
     </w:p>
     <w:p>
       <w:pPr>
-        <w:spacing w:after="160"/>
+        <w:spacing w:after="160" w:line="300" w:lineRule="auto"/>
       </w:pPr>
       <w:r>
         <w:rPr>
@@ -265,7 +272,7 @@
     </w:p>
     <w:p>
       <w:pPr>
-        <w:spacing w:after="160"/>
+        <w:spacing w:after="160" w:line="300" w:lineRule="auto"/>
       </w:pPr>
       <w:r>
         <w:rPr>
@@ -301,7 +308,7 @@
     </w:p>
     <w:p>
       <w:pPr>
-        <w:spacing w:after="280"/>
+        <w:spacing w:after="280" w:line="300" w:lineRule="auto"/>
       </w:pPr>
       <w:r>
         <w:rPr>
@@ -316,7 +323,10 @@
     </w:p>
     <w:p>
       <w:pPr>
-        <w:spacing w:after="200"/>
+        <w:spacing w:before="360" w:after="200" w:line="300" w:lineRule="auto"/>
+        <w:pBdr>
+          <w:bottom w:val="single" w:sz="6" w:space="4" w:color="999999"/>
+        </w:pBdr>
       </w:pPr>
       <w:r>
         <w:rPr>
@@ -327,12 +337,12 @@
           <w:spacing w:val="0"/>
           <w:color w:val="141414"/>
         </w:rPr>
-        <w:t xml:space="preserve">Concepts I used</w:t>
-      </w:r>
-    </w:p>
-    <w:p>
-      <w:pPr>
-        <w:spacing w:after="280"/>
+        <w:t xml:space="preserve">3. Concepts I used</w:t>
+      </w:r>
+    </w:p>
+    <w:p>
+      <w:pPr>
+        <w:spacing w:after="280" w:line="300" w:lineRule="auto"/>
       </w:pPr>
       <w:r>
         <w:rPr>
@@ -358,7 +368,7 @@
     </w:p>
     <w:p>
       <w:pPr>
-        <w:spacing w:after="280"/>
+        <w:spacing w:after="280" w:line="300" w:lineRule="auto"/>
       </w:pPr>
       <w:r>
         <w:rPr>
@@ -384,7 +394,7 @@
     </w:p>
     <w:p>
       <w:pPr>
-        <w:spacing w:after="280"/>
+        <w:spacing w:after="280" w:line="300" w:lineRule="auto"/>
       </w:pPr>
       <w:r>
         <w:rPr>
@@ -410,7 +420,7 @@
     </w:p>
     <w:p>
       <w:pPr>
-        <w:spacing w:after="280"/>
+        <w:spacing w:after="280" w:line="300" w:lineRule="auto"/>
       </w:pPr>
       <w:r>
         <w:rPr>
@@ -436,7 +446,10 @@
     </w:p>
     <w:p>
       <w:pPr>
-        <w:spacing w:after="200"/>
+        <w:spacing w:before="360" w:after="200" w:line="300" w:lineRule="auto"/>
+        <w:pBdr>
+          <w:bottom w:val="single" w:sz="6" w:space="4" w:color="999999"/>
+        </w:pBdr>
       </w:pPr>
       <w:r>
         <w:rPr>
@@ -447,7 +460,7 @@
           <w:spacing w:val="0"/>
           <w:color w:val="141414"/>
         </w:rPr>
-        <w:t xml:space="preserve">Program output</w:t>
+        <w:t xml:space="preserve">4. Program output</w:t>
       </w:r>
     </w:p>
     <w:p>
@@ -486,7 +499,9 @@
       </w:r>
     </w:p>
     <w:p>
-      <w:pPr/>
+      <w:pPr>
+        <w:spacing w:after="0" w:line="264" w:lineRule="auto"/>
+      </w:pPr>
       <w:r>
         <w:rPr>
           <w:rFonts w:ascii="Courier New" w:hAnsi="Courier New" w:cs="Courier New"/>
@@ -499,7 +514,9 @@
       </w:r>
     </w:p>
     <w:p>
-      <w:pPr/>
+      <w:pPr>
+        <w:spacing w:after="0" w:line="264" w:lineRule="auto"/>
+      </w:pPr>
       <w:r>
         <w:rPr>
           <w:rFonts w:ascii="Courier New" w:hAnsi="Courier New" w:cs="Courier New"/>
@@ -512,7 +529,9 @@
       </w:r>
     </w:p>
     <w:p>
-      <w:pPr/>
+      <w:pPr>
+        <w:spacing w:after="0" w:line="264" w:lineRule="auto"/>
+      </w:pPr>
       <w:r>
         <w:rPr>
           <w:rFonts w:ascii="Courier New" w:hAnsi="Courier New" w:cs="Courier New"/>
@@ -525,7 +544,9 @@
       </w:r>
     </w:p>
     <w:p>
-      <w:pPr/>
+      <w:pPr>
+        <w:spacing w:after="0" w:line="264" w:lineRule="auto"/>
+      </w:pPr>
       <w:r>
         <w:rPr>
           <w:rFonts w:ascii="Courier New" w:hAnsi="Courier New" w:cs="Courier New"/>
@@ -538,7 +559,9 @@
       </w:r>
     </w:p>
     <w:p>
-      <w:pPr/>
+      <w:pPr>
+        <w:spacing w:after="0" w:line="264" w:lineRule="auto"/>
+      </w:pPr>
       <w:r>
         <w:rPr>
           <w:rFonts w:ascii="Courier New" w:hAnsi="Courier New" w:cs="Courier New"/>
@@ -551,7 +574,9 @@
       </w:r>
     </w:p>
     <w:p>
-      <w:pPr/>
+      <w:pPr>
+        <w:spacing w:after="0" w:line="264" w:lineRule="auto"/>
+      </w:pPr>
       <w:r>
         <w:rPr>
           <w:rFonts w:ascii="Courier New" w:hAnsi="Courier New" w:cs="Courier New"/>
@@ -564,7 +589,9 @@
       </w:r>
     </w:p>
     <w:p>
-      <w:pPr/>
+      <w:pPr>
+        <w:spacing w:after="0" w:line="264" w:lineRule="auto"/>
+      </w:pPr>
       <w:r>
         <w:rPr>
           <w:rFonts w:ascii="Courier New" w:hAnsi="Courier New" w:cs="Courier New"/>
@@ -577,7 +604,9 @@
       </w:r>
     </w:p>
     <w:p>
-      <w:pPr/>
+      <w:pPr>
+        <w:spacing w:after="0" w:line="264" w:lineRule="auto"/>
+      </w:pPr>
       <w:r>
         <w:rPr>
           <w:rFonts w:ascii="Courier New" w:hAnsi="Courier New" w:cs="Courier New"/>
@@ -590,7 +619,9 @@
       </w:r>
     </w:p>
     <w:p>
-      <w:pPr/>
+      <w:pPr>
+        <w:spacing w:after="0" w:line="264" w:lineRule="auto"/>
+      </w:pPr>
       <w:r>
         <w:rPr>
           <w:rFonts w:ascii="Courier New" w:hAnsi="Courier New" w:cs="Courier New"/>
@@ -603,7 +634,9 @@
       </w:r>
     </w:p>
     <w:p>
-      <w:pPr/>
+      <w:pPr>
+        <w:spacing w:after="0" w:line="264" w:lineRule="auto"/>
+      </w:pPr>
       <w:r>
         <w:rPr>
           <w:rFonts w:ascii="Courier New" w:hAnsi="Courier New" w:cs="Courier New"/>
@@ -616,7 +649,9 @@
       </w:r>
     </w:p>
     <w:p>
-      <w:pPr/>
+      <w:pPr>
+        <w:spacing w:after="0" w:line="264" w:lineRule="auto"/>
+      </w:pPr>
       <w:r>
         <w:rPr>
           <w:rFonts w:ascii="Courier New" w:hAnsi="Courier New" w:cs="Courier New"/>
@@ -629,7 +664,9 @@
       </w:r>
     </w:p>
     <w:p>
-      <w:pPr/>
+      <w:pPr>
+        <w:spacing w:after="0" w:line="264" w:lineRule="auto"/>
+      </w:pPr>
       <w:r>
         <w:rPr>
           <w:rFonts w:ascii="Courier New" w:hAnsi="Courier New" w:cs="Courier New"/>
@@ -642,7 +679,9 @@
       </w:r>
     </w:p>
     <w:p>
-      <w:pPr/>
+      <w:pPr>
+        <w:spacing w:after="0" w:line="264" w:lineRule="auto"/>
+      </w:pPr>
       <w:r>
         <w:rPr>
           <w:rFonts w:ascii="Courier New" w:hAnsi="Courier New" w:cs="Courier New"/>
@@ -655,7 +694,9 @@
       </w:r>
     </w:p>
     <w:p>
-      <w:pPr/>
+      <w:pPr>
+        <w:spacing w:after="0" w:line="264" w:lineRule="auto"/>
+      </w:pPr>
       <w:r>
         <w:rPr>
           <w:rFonts w:ascii="Courier New" w:hAnsi="Courier New" w:cs="Courier New"/>
@@ -668,7 +709,9 @@
       </w:r>
     </w:p>
     <w:p>
-      <w:pPr/>
+      <w:pPr>
+        <w:spacing w:after="0" w:line="264" w:lineRule="auto"/>
+      </w:pPr>
       <w:r>
         <w:rPr>
           <w:rFonts w:ascii="Courier New" w:hAnsi="Courier New" w:cs="Courier New"/>
@@ -681,7 +724,9 @@
       </w:r>
     </w:p>
     <w:p>
-      <w:pPr/>
+      <w:pPr>
+        <w:spacing w:after="0" w:line="264" w:lineRule="auto"/>
+      </w:pPr>
       <w:r>
         <w:rPr>
           <w:rFonts w:ascii="Courier New" w:hAnsi="Courier New" w:cs="Courier New"/>
@@ -694,7 +739,9 @@
       </w:r>
     </w:p>
     <w:p>
-      <w:pPr/>
+      <w:pPr>
+        <w:spacing w:after="0" w:line="264" w:lineRule="auto"/>
+      </w:pPr>
       <w:r>
         <w:rPr>
           <w:rFonts w:ascii="Courier New" w:hAnsi="Courier New" w:cs="Courier New"/>
@@ -707,7 +754,9 @@
       </w:r>
     </w:p>
     <w:p>
-      <w:pPr/>
+      <w:pPr>
+        <w:spacing w:after="0" w:line="264" w:lineRule="auto"/>
+      </w:pPr>
       <w:r>
         <w:rPr>
           <w:rFonts w:ascii="Courier New" w:hAnsi="Courier New" w:cs="Courier New"/>
@@ -720,7 +769,9 @@
       </w:r>
     </w:p>
     <w:p>
-      <w:pPr/>
+      <w:pPr>
+        <w:spacing w:after="0" w:line="264" w:lineRule="auto"/>
+      </w:pPr>
       <w:r>
         <w:rPr>
           <w:rFonts w:ascii="Courier New" w:hAnsi="Courier New" w:cs="Courier New"/>
@@ -733,7 +784,9 @@
       </w:r>
     </w:p>
     <w:p>
-      <w:pPr/>
+      <w:pPr>
+        <w:spacing w:after="0" w:line="264" w:lineRule="auto"/>
+      </w:pPr>
       <w:r>
         <w:rPr>
           <w:rFonts w:ascii="Courier New" w:hAnsi="Courier New" w:cs="Courier New"/>
@@ -747,7 +800,7 @@
     </w:p>
     <w:p>
       <w:pPr>
-        <w:spacing w:after="280"/>
+        <w:spacing w:after="280" w:line="300" w:lineRule="auto"/>
       </w:pPr>
       <w:r>
         <w:rPr>
@@ -805,7 +858,10 @@
     </w:p>
     <w:p>
       <w:pPr>
-        <w:spacing w:after="200"/>
+        <w:spacing w:before="360" w:after="200" w:line="300" w:lineRule="auto"/>
+        <w:pBdr>
+          <w:bottom w:val="single" w:sz="6" w:space="4" w:color="999999"/>
+        </w:pBdr>
       </w:pPr>
       <w:r>
         <w:rPr>
@@ -816,12 +872,12 @@
           <w:spacing w:val="0"/>
           <w:color w:val="141414"/>
         </w:rPr>
-        <w:t xml:space="preserve">What I understood</w:t>
-      </w:r>
-    </w:p>
-    <w:p>
-      <w:pPr>
-        <w:spacing w:after="280"/>
+        <w:t xml:space="preserve">5. What I understood</w:t>
+      </w:r>
+    </w:p>
+    <w:p>
+      <w:pPr>
+        <w:spacing w:after="280" w:line="300" w:lineRule="auto"/>
       </w:pPr>
       <w:r>
         <w:rPr>
@@ -941,7 +997,7 @@
     </w:p>
     <w:p>
       <w:pPr>
-        <w:spacing w:after="160"/>
+        <w:spacing w:after="160" w:line="300" w:lineRule="auto"/>
       </w:pPr>
       <w:r>
         <w:rPr>
@@ -956,7 +1012,10 @@
     </w:p>
     <w:p>
       <w:pPr>
-        <w:spacing w:after="200"/>
+        <w:spacing w:before="360" w:after="200" w:line="300" w:lineRule="auto"/>
+        <w:pBdr>
+          <w:bottom w:val="single" w:sz="6" w:space="4" w:color="999999"/>
+        </w:pBdr>
       </w:pPr>
       <w:r>
         <w:rPr>
@@ -967,12 +1026,12 @@
           <w:spacing w:val="0"/>
           <w:color w:val="141414"/>
         </w:rPr>
-        <w:t xml:space="preserve">Challenges I faced and how I solved them</w:t>
-      </w:r>
-    </w:p>
-    <w:p>
-      <w:pPr>
-        <w:spacing w:after="120"/>
+        <w:t xml:space="preserve">6. Challenges I faced and how I solved them</w:t>
+      </w:r>
+    </w:p>
+    <w:p>
+      <w:pPr>
+        <w:spacing w:after="120" w:line="300" w:lineRule="auto"/>
       </w:pPr>
       <w:r>
         <w:rPr>
@@ -998,7 +1057,7 @@
     </w:p>
     <w:p>
       <w:pPr>
-        <w:spacing w:after="400"/>
+        <w:spacing w:after="400" w:line="300" w:lineRule="auto"/>
       </w:pPr>
       <w:r>
         <w:rPr>
@@ -1013,7 +1072,7 @@
     </w:p>
     <w:p>
       <w:pPr>
-        <w:spacing w:after="120"/>
+        <w:spacing w:after="120" w:line="300" w:lineRule="auto"/>
       </w:pPr>
       <w:r>
         <w:rPr>
@@ -1039,7 +1098,7 @@
     </w:p>
     <w:p>
       <w:pPr>
-        <w:spacing w:after="400"/>
+        <w:spacing w:after="400" w:line="300" w:lineRule="auto"/>
       </w:pPr>
       <w:r>
         <w:rPr>
@@ -1054,7 +1113,7 @@
     </w:p>
     <w:p>
       <w:pPr>
-        <w:spacing w:after="120"/>
+        <w:spacing w:after="120" w:line="300" w:lineRule="auto"/>
       </w:pPr>
       <w:r>
         <w:rPr>
@@ -1080,7 +1139,7 @@
     </w:p>
     <w:p>
       <w:pPr>
-        <w:spacing w:after="400"/>
+        <w:spacing w:after="400" w:line="300" w:lineRule="auto"/>
       </w:pPr>
       <w:r>
         <w:rPr>
@@ -1095,7 +1154,7 @@
     </w:p>
     <w:p>
       <w:pPr>
-        <w:spacing w:after="120"/>
+        <w:spacing w:after="120" w:line="300" w:lineRule="auto"/>
       </w:pPr>
       <w:r>
         <w:rPr>
@@ -1121,7 +1180,7 @@
     </w:p>
     <w:p>
       <w:pPr>
-        <w:spacing w:after="400"/>
+        <w:spacing w:after="400" w:line="300" w:lineRule="auto"/>
       </w:pPr>
       <w:r>
         <w:rPr>
@@ -1136,7 +1195,10 @@
     </w:p>
     <w:p>
       <w:pPr>
-        <w:spacing w:after="200"/>
+        <w:spacing w:before="360" w:after="200" w:line="300" w:lineRule="auto"/>
+        <w:pBdr>
+          <w:bottom w:val="single" w:sz="6" w:space="4" w:color="999999"/>
+        </w:pBdr>
       </w:pPr>
       <w:r>
         <w:rPr>
@@ -1147,12 +1209,12 @@
           <w:spacing w:val="0"/>
           <w:color w:val="141414"/>
         </w:rPr>
-        <w:t xml:space="preserve">Conclusion</w:t>
-      </w:r>
-    </w:p>
-    <w:p>
-      <w:pPr>
-        <w:spacing w:after="280"/>
+        <w:t xml:space="preserve">7. Conclusion</w:t>
+      </w:r>
+    </w:p>
+    <w:p>
+      <w:pPr>
+        <w:spacing w:after="280" w:line="300" w:lineRule="auto"/>
       </w:pPr>
       <w:r>
         <w:rPr>
@@ -1165,7 +1227,9 @@
         <w:t xml:space="preserve">Overall this assignment helped me actually use inheritance in Dart instead of just reading about it, and it gave me practice organizing a small project into more than one file. The program covers all four required pieces - variables, loops, functions, and a class hierarchy with inheritance - and I tested it by running it and checking the output matched what I expected for each case (available book, already issued, book not found, and returning a book).</w:t>
       </w:r>
     </w:p>
-    <w:sectPr/>
+    <w:sectPr>
+      <w:pgMar w:top="1080" w:right="1260" w:bottom="1080" w:left="1260" w:header="720" w:footer="720" w:gutter="0"/>
+    </w:sectPr>
   </w:body>
 </w:document>
 </file>

</xml_diff>